<commit_message>
Correct Arabic subscription names and complete client document visibility
</commit_message>
<xml_diff>
--- a/output/documents/subscription-individual.docx
+++ b/output/documents/subscription-individual.docx
@@ -516,7 +516,7 @@
                 <w:rtl/>
                 <w:szCs w:val="19"/>
               </w:rPr>
-              <w:t>اسم العميل كاملاً</w:t>
+              <w:t>اسم العميل كاملاً باللغة العربية</w:t>
             </w:r>
           </w:p>
           <w:p>
@@ -531,7 +531,7 @@
                 <w:color w:val="656575"/>
                 <w:sz w:val="15"/>
               </w:rPr>
-              <w:t>Customer full name</w:t>
+              <w:t>Customer full name in Arabic</w:t>
             </w:r>
           </w:p>
           <w:p>

</xml_diff>